<commit_message>
Add CR Updates: free-text update log on CR Repository + CR Detail history
New cr_updates table (migration included, must be run manually via
Supabase Studio — no direct DDL access from here) backs a popup on CR
Repository's new "Add Update" button: a text box (PMO/BA/ITPM only,
Admin read-only) plus the CR's full update history below it, each entry
timestamped and attributed. The same history also renders as its own
card on the CR Detail page.

Also carries crs.tsx's Release 1 flag gating for the Tested %/Deployment
columns (FEATURES.testing / FEATURES.deployment), committed alongside
this change since it touches the same file.

Functional spec doc updated (§5.3, §5.4) to describe the feature,
bumped to Version 4.3 — no release-flag content added, per instruction.
</commit_message>
<xml_diff>
--- a/KPIsavvy_Functional_Specification_Combined.docx
+++ b/KPIsavvy_Functional_Specification_Combined.docx
@@ -14,7 +14,7 @@
     </w:p>
     <w:p>
       <w:r>
-        <w:t>Document Version: 4.2</w:t>
+        <w:t>Document Version: 4.3</w:t>
         <w:br/>
         <w:t>Application Version: V4.0</w:t>
         <w:br/>
@@ -365,6 +365,48 @@
           <w:p>
             <w:r>
               <w:t>Corrected factual inaccuracies (deployment stage list, deployment eligibility rule, PMO/Admin/ITPM/BA responsibilities, test credentials), added the missing CR Repository, CR Planner, Planner Calendar working-days summary, deployment CR removal, and User Management entries, and added a full role-based access matrix to Section 4. No functional changes.</w:t>
+            </w:r>
+          </w:p>
+        </w:tc>
+        <w:tc>
+          <w:tcPr>
+            <w:tcW w:type="dxa" w:w="2160"/>
+          </w:tcPr>
+          <w:p>
+            <w:r>
+              <w:t>https://kpisavvy.vercel.app/</w:t>
+            </w:r>
+          </w:p>
+        </w:tc>
+      </w:tr>
+      <w:tr>
+        <w:tc>
+          <w:tcPr>
+            <w:tcW w:type="dxa" w:w="2160"/>
+          </w:tcPr>
+          <w:p>
+            <w:r>
+              <w:t>4.3</w:t>
+            </w:r>
+          </w:p>
+        </w:tc>
+        <w:tc>
+          <w:tcPr>
+            <w:tcW w:type="dxa" w:w="2160"/>
+          </w:tcPr>
+          <w:p>
+            <w:r>
+              <w:t>3 August 2026</w:t>
+            </w:r>
+          </w:p>
+        </w:tc>
+        <w:tc>
+          <w:tcPr>
+            <w:tcW w:type="dxa" w:w="2160"/>
+          </w:tcPr>
+          <w:p>
+            <w:r>
+              <w:t>Added CR Updates: a free-text update log on CR Repository (Submit button appears once text is entered, saved with a timestamp and the posting user), with the full history visible on the CR Detail page.</w:t>
             </w:r>
           </w:p>
         </w:tc>
@@ -1723,6 +1765,8 @@
         <w:br/>
         <w:t>• Inline update of Workflow Status and Deployment Stage.</w:t>
         <w:br/>
+        <w:t>• Updates column — a free-text box on each CR row; typing text reveals a Submit button, and each submission is saved with a timestamp and the posting user's name.</w:t>
+        <w:br/>
         <w:t>• Automatic KPI recalculation after workflow updates.</w:t>
         <w:br/>
         <w:t>• Clicking a CR opens the CR Detail page.</w:t>
@@ -1733,6 +1777,8 @@
         <w:t>• Administrator and PMO can view all CRs.</w:t>
         <w:br/>
         <w:t>• ITPM and BA can view assigned CRs or applications where they are configured as SPOCs.</w:t>
+        <w:br/>
+        <w:t>• Administrator can view CR Updates but cannot post one — only PMO, BA and ITPM can add updates, the same access as Workflow Status and Deployment Stage editing.</w:t>
       </w:r>
     </w:p>
     <w:p>
@@ -1759,6 +1805,8 @@
         <w:t>• KPI calculation summary.</w:t>
         <w:br/>
         <w:t>• Workflow history timeline.</w:t>
+        <w:br/>
+        <w:t>• Full Updates history — every update posted from CR Repository, newest first, each showing who posted it and when.</w:t>
         <w:br/>
         <w:t>• Linked open defects.</w:t>
         <w:br/>
@@ -2612,7 +2660,7 @@
     </w:p>
     <w:p>
       <w:r>
-        <w:t>This completes Version 4.2 of the KPIsavvy Application Overview &amp; Functional Summary.</w:t>
+        <w:t>This completes Version 4.3 of the KPIsavvy Application Overview &amp; Functional Summary.</w:t>
       </w:r>
     </w:p>
     <w:sectPr>

</xml_diff>